<commit_message>
fix(assessment): remove answer-revealing bold from student-facing MC options
The Regents-style cluster's 15 multiple-choice items had the correct
answer wrapped in <strong> / **bold**, which is fine for a teacher key
but visible (and obvious) to any student looking at the assessment
page. Reported during a tour of the live site.

Fix:
- Web edition (assessment.html): strip <strong>...</strong> from MC
  option lines (lines 68-96 only). Constructed-response (a)(b)(c)(d)
  emphasis and the collapsible answer key keep their <strong> labels.
- OneNote-friendly source (Kinematics_Regents_Style_Set.md): strip
  ** from option lines under '## Multiple Choice'. Stimulus, CR
  prompts, and the explicit '## Answer Key' section retain their bold.
- Rebuilt the .docx and .onenote.html artifacts via tools/build_lessons.

Verified: zero <strong> remain inside any MC option in either track.
The collapsible answer key remains the single place where correct
answers are revealed.
</commit_message>
<xml_diff>
--- a/Publisher_Ready_Curriculum/01_Physics_East_Meadow_Refactor/01_Kinematics/Assessments/Kinematics_Regents_Style_Set.docx
+++ b/Publisher_Ready_Curriculum/01_Physics_East_Meadow_Refactor/01_Kinematics/Assessments/Kinematics_Regents_Style_Set.docx
@@ -269,10 +269,6 @@
         </w:numPr>
       </w:pPr>
       <w:r>
-        <w:rPr>
-          <w:b/>
-          <w:bCs/>
-        </w:rPr>
         <w:t xml:space="preserve">2.0 m/s²</w:t>
       </w:r>
     </w:p>
@@ -327,10 +323,6 @@
         </w:numPr>
       </w:pPr>
       <w:r>
-        <w:rPr>
-          <w:b/>
-          <w:bCs/>
-        </w:rPr>
         <w:t xml:space="preserve">0 m/s²</w:t>
       </w:r>
     </w:p>
@@ -448,10 +440,6 @@
         </w:numPr>
       </w:pPr>
       <w:r>
-        <w:rPr>
-          <w:b/>
-          <w:bCs/>
-        </w:rPr>
         <w:t xml:space="preserve">−3.0 m/s²</w:t>
       </w:r>
     </w:p>
@@ -569,10 +557,6 @@
         </w:numPr>
       </w:pPr>
       <w:r>
-        <w:rPr>
-          <w:b/>
-          <w:bCs/>
-        </w:rPr>
         <w:t xml:space="preserve">1.0 N</w:t>
       </w:r>
     </w:p>
@@ -627,10 +611,6 @@
         </w:numPr>
       </w:pPr>
       <w:r>
-        <w:rPr>
-          <w:b/>
-          <w:bCs/>
-        </w:rPr>
         <w:t xml:space="preserve">0 N</w:t>
       </w:r>
     </w:p>
@@ -748,10 +728,6 @@
         </w:numPr>
       </w:pPr>
       <w:r>
-        <w:rPr>
-          <w:b/>
-          <w:bCs/>
-        </w:rPr>
         <w:t xml:space="preserve">opposite to the motion (backward)</w:t>
       </w:r>
     </w:p>
@@ -869,10 +845,6 @@
         </w:numPr>
       </w:pPr>
       <w:r>
-        <w:rPr>
-          <w:b/>
-          <w:bCs/>
-        </w:rPr>
         <w:t xml:space="preserve">9 m</w:t>
       </w:r>
     </w:p>
@@ -979,10 +951,6 @@
         </w:numPr>
       </w:pPr>
       <w:r>
-        <w:rPr>
-          <w:b/>
-          <w:bCs/>
-        </w:rPr>
         <w:t xml:space="preserve">24 m</w:t>
       </w:r>
     </w:p>
@@ -1079,10 +1047,6 @@
         </w:numPr>
       </w:pPr>
       <w:r>
-        <w:rPr>
-          <w:b/>
-          <w:bCs/>
-        </w:rPr>
         <w:t xml:space="preserve">39 m</w:t>
       </w:r>
     </w:p>
@@ -1168,10 +1132,6 @@
         </w:numPr>
       </w:pPr>
       <w:r>
-        <w:rPr>
-          <w:b/>
-          <w:bCs/>
-        </w:rPr>
         <w:t xml:space="preserve">Displacement = distance because the motion is in a single direction</w:t>
       </w:r>
     </w:p>
@@ -1305,10 +1265,6 @@
         </w:numPr>
       </w:pPr>
       <w:r>
-        <w:rPr>
-          <w:b/>
-          <w:bCs/>
-        </w:rPr>
         <w:t xml:space="preserve">twice as large</w:t>
       </w:r>
     </w:p>
@@ -1410,10 +1366,6 @@
         </w:numPr>
       </w:pPr>
       <w:r>
-        <w:rPr>
-          <w:b/>
-          <w:bCs/>
-        </w:rPr>
         <w:t xml:space="preserve">3 N</w:t>
       </w:r>
     </w:p>
@@ -1520,10 +1472,6 @@
         </w:numPr>
       </w:pPr>
       <w:r>
-        <w:rPr>
-          <w:b/>
-          <w:bCs/>
-        </w:rPr>
         <w:t xml:space="preserve">a straight line with positive slope</w:t>
       </w:r>
     </w:p>
@@ -1657,10 +1605,6 @@
         </w:numPr>
       </w:pPr>
       <w:r>
-        <w:rPr>
-          <w:b/>
-          <w:bCs/>
-        </w:rPr>
         <w:t xml:space="preserve">a parabola opening upward (slope grows)</w:t>
       </w:r>
     </w:p>
@@ -1736,10 +1680,6 @@
         </w:numPr>
       </w:pPr>
       <w:r>
-        <w:rPr>
-          <w:b/>
-          <w:bCs/>
-        </w:rPr>
         <w:t xml:space="preserve">Cause and Effect</w:t>
       </w:r>
     </w:p>

</xml_diff>